<commit_message>
ci: switch to self-hosted runner deployment (SOP); merge axios config
</commit_message>
<xml_diff>
--- a/docs/A2/EC2_Deploy_Guide.docx
+++ b/docs/A2/EC2_Deploy_Guide.docx
@@ -7,12 +7,12 @@
         <w:pStyle w:val="Title"/>
       </w:pPr>
       <w:r>
-        <w:t>IFQ636 A2 — Deploy to AWS EC2 (CI/CD §7)</w:t>
+        <w:t>IFQ636 A2 - Deploy to AWS EC2 with a GitHub self-hosted runner</w:t>
       </w:r>
     </w:p>
     <w:p>
       <w:r>
-        <w:t>Goal: get the app live on a public URL with GitHub Actions auto-deploying on every push, and pm2 showing the backend + frontend online — the evidence the CI/CD criterion (Step 7) asks for.</w:t>
+        <w:t>This follows the unit SOP: a GitHub Actions self-hosted runner installed ON the EC2 instance does the deployment. On every push to main the pipeline runs the unit tests, then (if they pass) builds the frontend and (re)starts the backend + frontend under pm2 on the box, with nginx serving the app on port 80.</w:t>
       </w:r>
     </w:p>
     <w:p>
@@ -21,7 +21,7 @@
           <w:i/>
           <w:color w:val="444444"/>
         </w:rPr>
-        <w:t>Use your OWN AWS account (free tier), not the shared student account — that avoids the Elastic IP / Instance Connect restrictions you hit before. ~45–60 min the first time.</w:t>
+        <w:t>Use your OWN AWS account. The SOP needs a t3.large (NOT free tier, ~US$0.075/hr) because the React build runs on the instance. Launch it, capture your evidence, then STOP or TERMINATE it the same day to keep the cost to a couple of dollars. Budget ~60-90 min the first time.</w:t>
       </w:r>
     </w:p>
     <w:p>
@@ -29,12 +29,7 @@
         <w:pStyle w:val="Heading1"/>
       </w:pPr>
       <w:r>
-        <w:t>Step 0 — Update the pipeline files in your repo (first!)</w:t>
-      </w:r>
-    </w:p>
-    <w:p>
-      <w:r>
-        <w:t>Replace these three files in your local project with the updated versions I sent (pm2 runs BOTH backend and frontend, correct repo path), then push:</w:t>
+        <w:t>Architecture (what you are building)</w:t>
       </w:r>
     </w:p>
     <w:p>
@@ -42,7 +37,7 @@
         <w:pStyle w:val="ListBullet"/>
       </w:pPr>
       <w:r>
-        <w:t>.github/workflows/ci.yml</w:t>
+        <w:t>Browser -&gt; http://&lt;public-ip&gt;/  -&gt; nginx (:80) -&gt; React SPA served by pm2 (:3000)</w:t>
       </w:r>
     </w:p>
     <w:p>
@@ -50,7 +45,7 @@
         <w:pStyle w:val="ListBullet"/>
       </w:pPr>
       <w:r>
-        <w:t>scripts/ec2-setup.sh</w:t>
+        <w:t>Browser -&gt; http://&lt;public-ip&gt;:5001/api/...  -&gt; Express backend served by pm2 (:5001)</w:t>
       </w:r>
     </w:p>
     <w:p>
@@ -58,7 +53,68 @@
         <w:pStyle w:val="ListBullet"/>
       </w:pPr>
       <w:r>
-        <w:t>scripts/nginx/restaurant-review.conf</w:t>
+        <w:t>GitHub push to main -&gt; self-hosted runner on the EC2 box runs test + deploy jobs</w:t>
+      </w:r>
+    </w:p>
+    <w:p>
+      <w:pPr>
+        <w:pStyle w:val="ListBullet"/>
+      </w:pPr>
+      <w:r>
+        <w:t>Secrets live in a GitHub Environment named PROD (MONGO_URI, JWT_SECRET, PORT)</w:t>
+      </w:r>
+    </w:p>
+    <w:p>
+      <w:pPr>
+        <w:pStyle w:val="Heading1"/>
+      </w:pPr>
+      <w:r>
+        <w:t>Step 0 - Update your repo files and push (do this FIRST, on your PC)</w:t>
+      </w:r>
+    </w:p>
+    <w:p>
+      <w:r>
+        <w:t>Five changes switch the project to the SOP deployment method. Make them in your local repo, then push:</w:t>
+      </w:r>
+    </w:p>
+    <w:p>
+      <w:pPr>
+        <w:pStyle w:val="ListBullet"/>
+      </w:pPr>
+      <w:r>
+        <w:t>.github/workflows/ci.yml - replace with the self-hosted-runner version (runs-on: self-hosted)</w:t>
+      </w:r>
+    </w:p>
+    <w:p>
+      <w:pPr>
+        <w:pStyle w:val="ListBullet"/>
+      </w:pPr>
+      <w:r>
+        <w:t>scripts/nginx/restaurant-review.conf - SOP nginx (/ -&gt; :3000)</w:t>
+      </w:r>
+    </w:p>
+    <w:p>
+      <w:pPr>
+        <w:pStyle w:val="ListBullet"/>
+      </w:pPr>
+      <w:r>
+        <w:t>scripts/ec2-setup.sh - SOP base setup (nvm + Node 22 + pm2 + yarn + nginx)</w:t>
+      </w:r>
+    </w:p>
+    <w:p>
+      <w:pPr>
+        <w:pStyle w:val="ListBullet"/>
+      </w:pPr>
+      <w:r>
+        <w:t>frontend/src/axiosConfig.jsx - now the single axios config (has the auth-token interceptor)</w:t>
+      </w:r>
+    </w:p>
+    <w:p>
+      <w:pPr>
+        <w:pStyle w:val="ListBullet"/>
+      </w:pPr>
+      <w:r>
+        <w:t>DELETE frontend/src/axiosConfig.js - the duplicate; CRA was using it instead of the .jsx</w:t>
       </w:r>
     </w:p>
     <w:p>
@@ -71,11 +127,22 @@
           <w:rFonts w:ascii="Consolas" w:hAnsi="Consolas"/>
           <w:sz w:val="18"/>
         </w:rPr>
-        <w:t>git add .github/workflows/ci.yml scripts/ec2-setup.sh scripts/nginx/restaurant-review.conf</w:t>
+        <w:t>git rm frontend/src/axiosConfig.js</w:t>
         <w:br/>
-        <w:t>git commit -m "ci: deploy to EC2 with pm2 (backend + frontend) behind nginx"</w:t>
+        <w:t>git add .github/workflows/ci.yml scripts/ec2-setup.sh scripts/nginx/restaurant-review.conf frontend/src/axiosConfig.jsx</w:t>
+        <w:br/>
+        <w:t>git commit -m "ci: switch to self-hosted runner deployment (SOP); merge axios config"</w:t>
         <w:br/>
         <w:t>git push</w:t>
+      </w:r>
+    </w:p>
+    <w:p>
+      <w:r>
+        <w:rPr>
+          <w:i/>
+          <w:color w:val="444444"/>
+        </w:rPr>
+        <w:t>This push queues a workflow run that just sits Queued until the self-hosted runner exists (Step 6). That is expected.</w:t>
       </w:r>
     </w:p>
     <w:p>
@@ -83,7 +150,7 @@
         <w:pStyle w:val="Heading1"/>
       </w:pPr>
       <w:r>
-        <w:t>Step 1 — Create an AWS account + key pair</w:t>
+        <w:t>Step 1 - AWS account + region</w:t>
       </w:r>
     </w:p>
     <w:p>
@@ -91,7 +158,7 @@
         <w:pStyle w:val="ListBullet"/>
       </w:pPr>
       <w:r>
-        <w:t>Sign up / log in at https://aws.amazon.com (free tier).</w:t>
+        <w:t>Log in at https://console.aws.amazon.com (your own free-tier-enabled account).</w:t>
       </w:r>
     </w:p>
     <w:p>
@@ -99,7 +166,15 @@
         <w:pStyle w:val="ListBullet"/>
       </w:pPr>
       <w:r>
-        <w:t>Search "EC2" → open the EC2 console → set the region to Asia Pacific (Sydney) ap-southeast-2 (top-right).</w:t>
+        <w:t>Top-right region selector -&gt; Asia Pacific (Sydney) ap-southeast-2.</w:t>
+      </w:r>
+    </w:p>
+    <w:p>
+      <w:pPr>
+        <w:pStyle w:val="ListBullet"/>
+      </w:pPr>
+      <w:r>
+        <w:t>Search EC2 -&gt; open the EC2 console.</w:t>
       </w:r>
     </w:p>
     <w:p>
@@ -107,7 +182,7 @@
         <w:pStyle w:val="Heading1"/>
       </w:pPr>
       <w:r>
-        <w:t>Step 2 — Launch the EC2 instance</w:t>
+        <w:t>Step 2 - Launch the instance (t3.large)</w:t>
       </w:r>
     </w:p>
     <w:p>
@@ -115,7 +190,7 @@
         <w:pStyle w:val="ListBullet"/>
       </w:pPr>
       <w:r>
-        <w:t>EC2 → Instances → Launch instances.</w:t>
+        <w:t>EC2 -&gt; Instances -&gt; Launch instances.</w:t>
       </w:r>
     </w:p>
     <w:p>
@@ -131,7 +206,7 @@
         <w:pStyle w:val="ListBullet"/>
       </w:pPr>
       <w:r>
-        <w:t>AMI: Ubuntu Server 22.04 LTS (Free tier eligible).</w:t>
+        <w:t>AMI: Ubuntu Server 22.04 LTS.</w:t>
       </w:r>
     </w:p>
     <w:p>
@@ -139,7 +214,7 @@
         <w:pStyle w:val="ListBullet"/>
       </w:pPr>
       <w:r>
-        <w:t>Instance type: t2.micro or t3.micro (Free tier eligible).</w:t>
+        <w:t>Instance type: t3.large  (the SOP requires this - the React build needs the RAM).</w:t>
       </w:r>
     </w:p>
     <w:p>
@@ -147,7 +222,7 @@
         <w:pStyle w:val="ListBullet"/>
       </w:pPr>
       <w:r>
-        <w:t>Key pair: Create new key pair → name it mesa-key → type RSA → .pem → Download (keep the .pem safe; you need it for SSH + the GitHub secret).</w:t>
+        <w:t>Key pair: Create new key pair -&gt; name mesa-key -&gt; RSA -&gt; .pem -&gt; Download (keep it safe).</w:t>
       </w:r>
     </w:p>
     <w:p>
@@ -155,7 +230,33 @@
         <w:pStyle w:val="ListBullet"/>
       </w:pPr>
       <w:r>
-        <w:t>Network settings → Allow SSH (22) from your IP, and tick Allow HTTP traffic from the internet (port 80).</w:t>
+        <w:t>Network settings -&gt; Edit -&gt; Allow SSH (22) from My IP, and Allow HTTP (80) from the internet.</w:t>
+      </w:r>
+    </w:p>
+    <w:p>
+      <w:r>
+        <w:t>Launch the instance, then add the backend port to the security group (Step 4 below).</w:t>
+      </w:r>
+    </w:p>
+    <w:p>
+      <w:pPr>
+        <w:pStyle w:val="Heading1"/>
+      </w:pPr>
+      <w:r>
+        <w:t>Step 3 - Note the public IP</w:t>
+      </w:r>
+    </w:p>
+    <w:p>
+      <w:r>
+        <w:t>Instances -&gt; select yours -&gt; wait for Running + 2/2 status checks -&gt; copy the Public IPv4 address (e.g. 3.106.x.x). This is your public URL and the IP you put in axiosConfig.jsx.</w:t>
+      </w:r>
+    </w:p>
+    <w:p>
+      <w:pPr>
+        <w:pStyle w:val="Heading1"/>
+      </w:pPr>
+      <w:r>
+        <w:t>Step 4 - Open the security group ports</w:t>
       </w:r>
     </w:p>
     <w:p>
@@ -163,12 +264,36 @@
         <w:pStyle w:val="ListBullet"/>
       </w:pPr>
       <w:r>
-        <w:t>Launch instance. Wait until Instance state = Running and Status checks pass.</w:t>
+        <w:t>Instance -&gt; Security tab -&gt; click the security group -&gt; Edit inbound rules -&gt; Add rule for each:</w:t>
+      </w:r>
+    </w:p>
+    <w:p>
+      <w:pPr>
+        <w:pStyle w:val="ListBullet"/>
+      </w:pPr>
+      <w:r>
+        <w:t>SSH - TCP 22 - My IP</w:t>
+      </w:r>
+    </w:p>
+    <w:p>
+      <w:pPr>
+        <w:pStyle w:val="ListBullet"/>
+      </w:pPr>
+      <w:r>
+        <w:t>HTTP - TCP 80 - 0.0.0.0/0</w:t>
+      </w:r>
+    </w:p>
+    <w:p>
+      <w:pPr>
+        <w:pStyle w:val="ListBullet"/>
+      </w:pPr>
+      <w:r>
+        <w:t>Custom TCP - TCP 5001 - 0.0.0.0/0  (so the browser can reach the backend API)</w:t>
       </w:r>
     </w:p>
     <w:p>
       <w:r>
-        <w:t>Copy the instance’s Public IPv4 address (e.g. 3.106.x.x) — this is your EC2_HOST and public URL.</w:t>
+        <w:t>Save rules.</w:t>
       </w:r>
     </w:p>
     <w:p>
@@ -176,12 +301,17 @@
         <w:pStyle w:val="Heading1"/>
       </w:pPr>
       <w:r>
-        <w:t>Step 3 — Connect to the instance</w:t>
+        <w:t>Step 5 - Connect + install the base toolchain</w:t>
       </w:r>
     </w:p>
     <w:p>
       <w:r>
-        <w:t>Easiest: EC2 → select the instance → Connect → EC2 Instance Connect tab → Connect (opens a browser terminal). Or SSH from your PC:</w:t>
+        <w:t>Connect: EC2 -&gt; select instance -&gt; Connect -&gt; EC2 Instance Connect -&gt; Connect (browser terminal).</w:t>
+      </w:r>
+    </w:p>
+    <w:p>
+      <w:r>
+        <w:t>Clone your repo and run the base setup script (installs nginx, Node 22 via nvm, pm2, yarn, nginx site):</w:t>
       </w:r>
     </w:p>
     <w:p>
@@ -194,15 +324,18 @@
           <w:rFonts w:ascii="Consolas" w:hAnsi="Consolas"/>
           <w:sz w:val="18"/>
         </w:rPr>
-        <w:t>ssh -i path\to\mesa-key.pem ubuntu@&lt;PUBLIC_IP&gt;</w:t>
+        <w:t>git clone https://github.com/david1carver/restaurant-review-platform.git</w:t>
+        <w:br/>
+        <w:t>cd restaurant-review-platform</w:t>
+        <w:br/>
+        <w:t>chmod +x scripts/ec2-setup.sh</w:t>
+        <w:br/>
+        <w:t>./scripts/ec2-setup.sh</w:t>
       </w:r>
     </w:p>
     <w:p>
-      <w:pPr>
-        <w:pStyle w:val="Heading1"/>
-      </w:pPr>
       <w:r>
-        <w:t>Step 4 — Provision the server (on the instance)</w:t>
+        <w:t>If you prefer to do it by hand (matches the SOP exactly), run these instead of the script:</w:t>
       </w:r>
     </w:p>
     <w:p>
@@ -215,21 +348,22 @@
           <w:rFonts w:ascii="Consolas" w:hAnsi="Consolas"/>
           <w:sz w:val="18"/>
         </w:rPr>
-        <w:t># clone your repo</w:t>
+        <w:t>sudo apt-get update &amp;&amp; sudo apt-get install -y nginx curl git</w:t>
         <w:br/>
-        <w:t>git clone https://github.com/david1carver/restaurant-review-platform.git</w:t>
+        <w:t>curl -o- https://raw.githubusercontent.com/nvm-sh/nvm/v0.39.1/install.sh | bash</w:t>
         <w:br/>
-        <w:t>cd restaurant-review-platform</w:t>
+        <w:t>source ~/.bashrc</w:t>
         <w:br/>
+        <w:t>nvm install 22</w:t>
         <w:br/>
-        <w:t># create the backend env file (same MONGO_URI + JWT_SECRET as local)</w:t>
+        <w:t>node --version</w:t>
         <w:br/>
-        <w:t>nano backend/.env</w:t>
+        <w:t>npm install -g pm2 yarn</w:t>
       </w:r>
     </w:p>
     <w:p>
       <w:r>
-        <w:t>Paste these three lines into nano, then Ctrl+O, Enter, Ctrl+X to save:</w:t>
+        <w:t>Then set the nginx site and restart it:</w:t>
       </w:r>
     </w:p>
     <w:p>
@@ -242,16 +376,61 @@
           <w:rFonts w:ascii="Consolas" w:hAnsi="Consolas"/>
           <w:sz w:val="18"/>
         </w:rPr>
-        <w:t>MONGO_URI=&lt;your MongoDB Atlas string&gt;</w:t>
+        <w:t>sudo cp ~/restaurant-review-platform/scripts/nginx/restaurant-review.conf /etc/nginx/sites-available/default</w:t>
         <w:br/>
-        <w:t>JWT_SECRET=&lt;your secret&gt;</w:t>
+        <w:t>sudo nginx -t</w:t>
         <w:br/>
-        <w:t>PORT=5001</w:t>
+        <w:t>sudo service nginx restart</w:t>
       </w:r>
     </w:p>
     <w:p>
       <w:r>
-        <w:t>Run the setup script (installs Node 20, pm2, nginx; starts backend + frontend under pm2; configures nginx):</w:t>
+        <w:t>Visit http://&lt;public-ip&gt;/ - nginx is up if you get a 502 (frontend not started yet). We start the app via CI/CD shortly.</w:t>
+      </w:r>
+    </w:p>
+    <w:p>
+      <w:pPr>
+        <w:pStyle w:val="Heading1"/>
+      </w:pPr>
+      <w:r>
+        <w:t>Step 6 - Install the GitHub self-hosted runner (on the instance)</w:t>
+      </w:r>
+    </w:p>
+    <w:p>
+      <w:pPr>
+        <w:pStyle w:val="ListBullet"/>
+      </w:pPr>
+      <w:r>
+        <w:t>On GitHub: repo -&gt; Settings -&gt; Actions -&gt; Runners -&gt; New self-hosted runner.</w:t>
+      </w:r>
+    </w:p>
+    <w:p>
+      <w:pPr>
+        <w:pStyle w:val="ListBullet"/>
+      </w:pPr>
+      <w:r>
+        <w:t>Runner image: Linux. Architecture: x64.</w:t>
+      </w:r>
+    </w:p>
+    <w:p>
+      <w:pPr>
+        <w:pStyle w:val="ListBullet"/>
+      </w:pPr>
+      <w:r>
+        <w:t>Copy the Download and Configure commands GitHub shows and paste them into the EC2 terminal,</w:t>
+      </w:r>
+    </w:p>
+    <w:p>
+      <w:pPr>
+        <w:pStyle w:val="ListBullet"/>
+      </w:pPr>
+      <w:r>
+        <w:t>one block at a time. Run everything EXCEPT the final ./run.sh command.</w:t>
+      </w:r>
+    </w:p>
+    <w:p>
+      <w:r>
+        <w:t>When config.sh asks for a runner group / name / labels, press Enter to accept defaults. Then install it as a service so it keeps running:</w:t>
       </w:r>
     </w:p>
     <w:p>
@@ -264,14 +443,179 @@
           <w:rFonts w:ascii="Consolas" w:hAnsi="Consolas"/>
           <w:sz w:val="18"/>
         </w:rPr>
-        <w:t>chmod +x scripts/ec2-setup.sh</w:t>
+        <w:t>sudo ./svc.sh install</w:t>
         <w:br/>
-        <w:t>./scripts/ec2-setup.sh</w:t>
+        <w:t>sudo ./svc.sh start</w:t>
+        <w:br/>
+        <w:t>sudo ./svc.sh status</w:t>
       </w:r>
     </w:p>
     <w:p>
       <w:r>
-        <w:t>It will print a "pm2 startup" command near the end — copy that whole sudo ... command and run it (makes pm2 auto-start on reboot). Then:</w:t>
+        <w:t>Back on GitHub (Settings -&gt; Actions -&gt; Runners) the runner should now show Idle (green).</w:t>
+      </w:r>
+    </w:p>
+    <w:p>
+      <w:r>
+        <w:rPr>
+          <w:i/>
+          <w:color w:val="444444"/>
+        </w:rPr>
+        <w:t>The runner runs as the ubuntu user, so it can see the Node 22 you installed via nvm. The workflow sources nvm in each step, so node/npm/yarn/pm2 are all found.</w:t>
+      </w:r>
+    </w:p>
+    <w:p>
+      <w:pPr>
+        <w:pStyle w:val="Heading1"/>
+      </w:pPr>
+      <w:r>
+        <w:t>Step 7 - Add the PROD environment + secrets</w:t>
+      </w:r>
+    </w:p>
+    <w:p>
+      <w:pPr>
+        <w:pStyle w:val="ListBullet"/>
+      </w:pPr>
+      <w:r>
+        <w:t>Repo -&gt; Settings -&gt; Environments -&gt; New environment -&gt; name it PROD -&gt; Configure.</w:t>
+      </w:r>
+    </w:p>
+    <w:p>
+      <w:pPr>
+        <w:pStyle w:val="ListBullet"/>
+      </w:pPr>
+      <w:r>
+        <w:t>Add environment secret MONGO_URI = your MongoDB Atlas connection string.</w:t>
+      </w:r>
+    </w:p>
+    <w:p>
+      <w:pPr>
+        <w:pStyle w:val="ListBullet"/>
+      </w:pPr>
+      <w:r>
+        <w:t>Add environment secret JWT_SECRET = your JWT secret (same as local).</w:t>
+      </w:r>
+    </w:p>
+    <w:p>
+      <w:pPr>
+        <w:pStyle w:val="ListBullet"/>
+      </w:pPr>
+      <w:r>
+        <w:t>Add environment secret PORT = 5001.</w:t>
+      </w:r>
+    </w:p>
+    <w:p>
+      <w:r>
+        <w:t>The SOP also adds a repository secret called PROD (Settings -&gt; Secrets and variables -&gt; Actions -&gt; New repository secret). Our workflow keys off the PROD environment above, so this repo secret is optional - add it (any value, e.g. true) if you want your screenshots to match the SOP exactly.</w:t>
+      </w:r>
+    </w:p>
+    <w:p>
+      <w:pPr>
+        <w:pStyle w:val="Heading1"/>
+      </w:pPr>
+      <w:r>
+        <w:t>Step 8 - Point the frontend at your public IP, then push</w:t>
+      </w:r>
+    </w:p>
+    <w:p>
+      <w:r>
+        <w:t>Edit frontend/src/axiosConfig.jsx in your local repo: comment the localhost line and uncomment the live line, replacing the IP with YOUR public IPv4:</w:t>
+      </w:r>
+    </w:p>
+    <w:p>
+      <w:pPr>
+        <w:spacing w:after="120"/>
+        <w:ind w:left="240"/>
+      </w:pPr>
+      <w:r>
+        <w:rPr>
+          <w:rFonts w:ascii="Consolas" w:hAnsi="Consolas"/>
+          <w:sz w:val="18"/>
+        </w:rPr>
+        <w:t>// baseURL: 'http://localhost:5001', // local development</w:t>
+        <w:br/>
+        <w:t>baseURL: 'http://3.106.x.x:5001', // live (EC2)</w:t>
+      </w:r>
+    </w:p>
+    <w:p>
+      <w:r>
+        <w:t>Commit and push to main (no feature branch this time):</w:t>
+      </w:r>
+    </w:p>
+    <w:p>
+      <w:pPr>
+        <w:spacing w:after="120"/>
+        <w:ind w:left="240"/>
+      </w:pPr>
+      <w:r>
+        <w:rPr>
+          <w:rFonts w:ascii="Consolas" w:hAnsi="Consolas"/>
+          <w:sz w:val="18"/>
+        </w:rPr>
+        <w:t>git checkout main</w:t>
+        <w:br/>
+        <w:t>git add frontend/src/axiosConfig.jsx</w:t>
+        <w:br/>
+        <w:t>git commit -m "config: set live API base URL to EC2 public IP"</w:t>
+        <w:br/>
+        <w:t>git push origin main</w:t>
+      </w:r>
+    </w:p>
+    <w:p>
+      <w:pPr>
+        <w:pStyle w:val="Heading1"/>
+      </w:pPr>
+      <w:r>
+        <w:t>Step 9 - Watch the pipeline deploy</w:t>
+      </w:r>
+    </w:p>
+    <w:p>
+      <w:pPr>
+        <w:pStyle w:val="ListBullet"/>
+      </w:pPr>
+      <w:r>
+        <w:t>Repo -&gt; Actions -&gt; open the latest run.</w:t>
+      </w:r>
+    </w:p>
+    <w:p>
+      <w:pPr>
+        <w:pStyle w:val="ListBullet"/>
+      </w:pPr>
+      <w:r>
+        <w:t>Run unit tests (self-hosted) -&gt; green.</w:t>
+      </w:r>
+    </w:p>
+    <w:p>
+      <w:pPr>
+        <w:pStyle w:val="ListBullet"/>
+      </w:pPr>
+      <w:r>
+        <w:t>Deploy to EC2 (self-hosted) -&gt; green: it writes .env, restarts the backend, builds + serves the frontend, and saves pm2.</w:t>
+      </w:r>
+    </w:p>
+    <w:p>
+      <w:r>
+        <w:t>On the EC2 terminal, confirm both processes are online:</w:t>
+      </w:r>
+    </w:p>
+    <w:p>
+      <w:pPr>
+        <w:spacing w:after="120"/>
+        <w:ind w:left="240"/>
+      </w:pPr>
+      <w:r>
+        <w:rPr>
+          <w:rFonts w:ascii="Consolas" w:hAnsi="Consolas"/>
+          <w:sz w:val="18"/>
+        </w:rPr>
+        <w:t>export NVM_DIR="$HOME/.nvm"; . "$NVM_DIR/nvm.sh"</w:t>
+        <w:br/>
+        <w:t>pm2 status</w:t>
+      </w:r>
+    </w:p>
+    <w:p>
+      <w:r>
+        <w:t>You should see backend and Frontend both online. To make them survive a reboot:</w:t>
       </w:r>
     </w:p>
     <w:p>
@@ -286,12 +630,7 @@
         </w:rPr>
         <w:t>pm2 save</w:t>
         <w:br/>
-        <w:t>pm2 status        # should show mesa-backend AND mesa-frontend = online</w:t>
-      </w:r>
-    </w:p>
-    <w:p>
-      <w:r>
-        <w:t>Test from your browser: http://&lt;PUBLIC_IP&gt;/  (the app) and http://&lt;PUBLIC_IP&gt;/api/health → {"status":"OK"}.</w:t>
+        <w:t>pm2 startup systemd   # run the sudo ... line it prints, then: pm2 save</w:t>
       </w:r>
     </w:p>
     <w:p>
@@ -299,12 +638,7 @@
         <w:pStyle w:val="Heading1"/>
       </w:pPr>
       <w:r>
-        <w:t>Step 5 — Add the GitHub Actions secrets</w:t>
-      </w:r>
-    </w:p>
-    <w:p>
-      <w:r>
-        <w:t>In the repo → Settings → Secrets and variables → Actions → New repository secret. Add:</w:t>
+        <w:t>Step 10 - Open the app + capture the report evidence (7.1-7.4)</w:t>
       </w:r>
     </w:p>
     <w:p>
@@ -312,7 +646,7 @@
         <w:pStyle w:val="ListBullet"/>
       </w:pPr>
       <w:r>
-        <w:t>EC2_HOST  =  your instance Public IPv4 (e.g. 3.106.x.x)</w:t>
+        <w:t>Browse http://&lt;public-ip&gt;/ - register/login, browse restaurants, post a review, see notifications.</w:t>
       </w:r>
     </w:p>
     <w:p>
@@ -320,7 +654,7 @@
         <w:pStyle w:val="ListBullet"/>
       </w:pPr>
       <w:r>
-        <w:t>EC2_USER  =  ubuntu</w:t>
+        <w:t>7.1 - screenshot .github/workflows/ci.yml (the self-hosted-runner pipeline).</w:t>
       </w:r>
     </w:p>
     <w:p>
@@ -328,7 +662,7 @@
         <w:pStyle w:val="ListBullet"/>
       </w:pPr>
       <w:r>
-        <w:t>EC2_SSH_KEY  =  the FULL contents of your mesa-key.pem (open it in Notepad, copy everything incl. the BEGIN/END lines)</w:t>
+        <w:t>7.2 - screenshot pm2 status showing backend + Frontend online.</w:t>
       </w:r>
     </w:p>
     <w:p>
@@ -336,48 +670,7 @@
         <w:pStyle w:val="ListBullet"/>
       </w:pPr>
       <w:r>
-        <w:t>PUBLIC_API_URL  =  leave blank (nginx proxies /api same-origin)</w:t>
-      </w:r>
-    </w:p>
-    <w:p>
-      <w:pPr>
-        <w:pStyle w:val="Heading1"/>
-      </w:pPr>
-      <w:r>
-        <w:t>Step 6 — Trigger the deploy</w:t>
-      </w:r>
-    </w:p>
-    <w:p>
-      <w:r>
-        <w:t>Push any commit to main (e.g. a tiny README edit), or re-run the latest workflow:</w:t>
-      </w:r>
-    </w:p>
-    <w:p>
-      <w:pPr>
-        <w:spacing w:after="120"/>
-        <w:ind w:left="240"/>
-      </w:pPr>
-      <w:r>
-        <w:rPr>
-          <w:rFonts w:ascii="Consolas" w:hAnsi="Consolas"/>
-          <w:sz w:val="18"/>
-        </w:rPr>
-        <w:t>git commit --allow-empty -m "ci: trigger deploy"</w:t>
-        <w:br/>
-        <w:t>git push</w:t>
-      </w:r>
-    </w:p>
-    <w:p>
-      <w:r>
-        <w:t>Repo → Actions → open the run → both the test job and the Deploy to EC2 job should go green.</w:t>
-      </w:r>
-    </w:p>
-    <w:p>
-      <w:pPr>
-        <w:pStyle w:val="Heading1"/>
-      </w:pPr>
-      <w:r>
-        <w:t>Step 7 — Capture the report evidence (§7.1–7.4)</w:t>
+        <w:t>7.3 - screenshot the green Actions run (test + deploy jobs) AND Settings -&gt; Actions -&gt; Runners showing your self-hosted runner.</w:t>
       </w:r>
     </w:p>
     <w:p>
@@ -385,36 +678,12 @@
         <w:pStyle w:val="ListBullet"/>
       </w:pPr>
       <w:r>
-        <w:t>7.1 — screenshot the ci.yml file (GitHub or VS Code).</w:t>
-      </w:r>
-    </w:p>
-    <w:p>
-      <w:pPr>
-        <w:pStyle w:val="ListBullet"/>
-      </w:pPr>
-      <w:r>
-        <w:t>7.2 — on the instance run  pm2 status  → screenshot showing mesa-backend AND mesa-frontend online.</w:t>
-      </w:r>
-    </w:p>
-    <w:p>
-      <w:pPr>
-        <w:pStyle w:val="ListBullet"/>
-      </w:pPr>
-      <w:r>
-        <w:t>7.3 — Actions → the green run (test + deploy jobs passing).</w:t>
-      </w:r>
-    </w:p>
-    <w:p>
-      <w:pPr>
-        <w:pStyle w:val="ListBullet"/>
-      </w:pPr>
-      <w:r>
-        <w:t>7.4 — browser at http://&lt;PUBLIC_IP&gt;/ with the address bar (public IP) visible.</w:t>
+        <w:t>7.4 - screenshot the app in the browser with the public IP visible in the address bar.</w:t>
       </w:r>
     </w:p>
     <w:p>
       <w:r>
-        <w:t>Put the public URL on the report cover and in §7.4, and in Part C.</w:t>
+        <w:t>Put the public URL on the report cover, in 7.4, and in Part C. Tell me the IP and I will update the report and reframe 7 from constraint to a working self-hosted-runner deployment.</w:t>
       </w:r>
     </w:p>
     <w:p>
@@ -430,7 +699,7 @@
         <w:pStyle w:val="ListBullet"/>
       </w:pPr>
       <w:r>
-        <w:t>Deploy job fails at scp/ssh → check the 3 secrets; EC2_SSH_KEY must include the BEGIN/END lines and all newlines.</w:t>
+        <w:t>Workflow stuck Queued -&gt; the runner is not Idle. On the box: sudo ./svc.sh status; sudo ./svc.sh start.</w:t>
       </w:r>
     </w:p>
     <w:p>
@@ -438,7 +707,7 @@
         <w:pStyle w:val="ListBullet"/>
       </w:pPr>
       <w:r>
-        <w:t>App not loading in browser → security group must allow inbound port 80; nginx running (sudo systemctl status nginx).</w:t>
+        <w:t>Deploy step pm2: command not found -&gt; the runner cannot see nvm. Confirm node was installed for the ubuntu user (ls ~/.nvm) and re-run the job.</w:t>
       </w:r>
     </w:p>
     <w:p>
@@ -446,7 +715,7 @@
         <w:pStyle w:val="ListBullet"/>
       </w:pPr>
       <w:r>
-        <w:t>Backend can’t reach Mongo → Atlas Network Access already allows 0.0.0.0/0 (you set this), so it should connect.</w:t>
+        <w:t>App loads but API calls fail -&gt; axiosConfig.jsx live IP wrong, or port 5001 not open in the security group. Test the API directly: http://&lt;public-ip&gt;:5001/api/health -&gt; {"status":"OK"}.</w:t>
       </w:r>
     </w:p>
     <w:p>
@@ -454,7 +723,7 @@
         <w:pStyle w:val="ListBullet"/>
       </w:pPr>
       <w:r>
-        <w:t>pm2 not found after reboot → re-run the pm2 startup command it printed, then pm2 save.</w:t>
+        <w:t>yarn build runs out of memory -&gt; you launched a smaller instance than t3.large. Resize it.</w:t>
       </w:r>
     </w:p>
     <w:p>
@@ -462,16 +731,15 @@
         <w:pStyle w:val="ListBullet"/>
       </w:pPr>
       <w:r>
-        <w:t>Free tier: stop the instance when not needed to avoid charges; note the public IP changes on stop/start unless you attach an Elastic IP (one is free while attached to a running instance).</w:t>
+        <w:t>nginx 502 -&gt; the frontend pm2 process is not up yet; re-run the deploy job.</w:t>
       </w:r>
     </w:p>
     <w:p>
+      <w:pPr>
+        <w:pStyle w:val="ListBullet"/>
+      </w:pPr>
       <w:r>
-        <w:rPr>
-          <w:i/>
-          <w:color w:val="444444"/>
-        </w:rPr>
-        <w:t>Once this is live, tell me your public IP and I’ll update the report cover, §7, and Part C with it, and reframe the §7 text from “constraint” to a working EC2 deployment.</w:t>
+        <w:t>Cost -&gt; STOP or TERMINATE the t3.large when finished. The public IP changes on stop/start unless you attach an Elastic IP (free while attached to a running instance).</w:t>
       </w:r>
     </w:p>
     <w:sectPr>

</xml_diff>

<commit_message>
ci: align pipeline + guide to unit SOP (single job, PROD secret, pm2 stop/start/restart)
</commit_message>
<xml_diff>
--- a/docs/A2/EC2_Deploy_Guide.docx
+++ b/docs/A2/EC2_Deploy_Guide.docx
@@ -7,12 +7,12 @@
         <w:pStyle w:val="Title"/>
       </w:pPr>
       <w:r>
-        <w:t>IFQ636 A2 - Deploy to AWS EC2 with a GitHub self-hosted runner</w:t>
+        <w:t>IFQ636 A2 - Deploy to AWS EC2 (self-hosted runner, per unit SOP)</w:t>
       </w:r>
     </w:p>
     <w:p>
       <w:r>
-        <w:t>This follows the unit SOP: a GitHub Actions self-hosted runner installed ON the EC2 instance does the deployment. On every push to main the pipeline runs the unit tests, then (if they pass) builds the frontend and (re)starts the backend + frontend under pm2 on the box, with nginx serving the app on port 80.</w:t>
+        <w:t>This matches the unit SOP. A GitHub Actions self-hosted runner installed ON the EC2 instance runs one "Run Tests" job on every push to main: it stops the app, installs deps, builds the frontend (yarn), runs the unit tests, writes the production .env from the PROD secret, then restarts the backend + frontend under pm2. nginx serves the app on port 80.</w:t>
       </w:r>
     </w:p>
     <w:p>
@@ -21,7 +21,7 @@
           <w:i/>
           <w:color w:val="444444"/>
         </w:rPr>
-        <w:t>Use your OWN AWS account. The SOP needs a t3.large (NOT free tier, ~US$0.075/hr) because the React build runs on the instance. Launch it, capture your evidence, then STOP or TERMINATE it the same day to keep the cost to a couple of dollars. Budget ~60-90 min the first time.</w:t>
+        <w:t>Use your OWN AWS account. The SOP needs a t3.large (NOT free tier, ~US$0.075/hr) - the React build runs on the box. Launch it, capture evidence, then STOP/TERMINATE it the same day. Budget ~75-90 min the first time.</w:t>
       </w:r>
     </w:p>
     <w:p>
@@ -29,7 +29,7 @@
         <w:pStyle w:val="Heading1"/>
       </w:pPr>
       <w:r>
-        <w:t>Architecture (what you are building)</w:t>
+        <w:t>How the pieces fit</w:t>
       </w:r>
     </w:p>
     <w:p>
@@ -37,7 +37,7 @@
         <w:pStyle w:val="ListBullet"/>
       </w:pPr>
       <w:r>
-        <w:t>Browser -&gt; http://&lt;public-ip&gt;/  -&gt; nginx (:80) -&gt; React SPA served by pm2 (:3000)</w:t>
+        <w:t>Browser -&gt; http://&lt;public-ip&gt;/  -&gt; nginx (:80) -&gt; React SPA served by pm2 "Frontend" (:3000)</w:t>
       </w:r>
     </w:p>
     <w:p>
@@ -45,7 +45,7 @@
         <w:pStyle w:val="ListBullet"/>
       </w:pPr>
       <w:r>
-        <w:t>Browser -&gt; http://&lt;public-ip&gt;:5001/api/...  -&gt; Express backend served by pm2 (:5001)</w:t>
+        <w:t>Browser -&gt; http://&lt;public-ip&gt;:5001/api/...  -&gt; Express backend, pm2 "backend" (:5001)</w:t>
       </w:r>
     </w:p>
     <w:p>
@@ -53,7 +53,7 @@
         <w:pStyle w:val="ListBullet"/>
       </w:pPr>
       <w:r>
-        <w:t>GitHub push to main -&gt; self-hosted runner on the EC2 box runs test + deploy jobs</w:t>
+        <w:t>Push to main -&gt; self-hosted runner builds + tests + restarts pm2</w:t>
       </w:r>
     </w:p>
     <w:p>
@@ -61,7 +61,7 @@
         <w:pStyle w:val="ListBullet"/>
       </w:pPr>
       <w:r>
-        <w:t>Secrets live in a GitHub Environment named PROD (MONGO_URI, JWT_SECRET, PORT)</w:t>
+        <w:t>Secrets: environment "MONGO_URI" holds MONGO_URI/JWT_SECRET/PORT (for the test step); repository secret PROD holds the whole .env file (for production)</w:t>
       </w:r>
     </w:p>
     <w:p>
@@ -69,12 +69,20 @@
         <w:pStyle w:val="Heading1"/>
       </w:pPr>
       <w:r>
-        <w:t>Step 0 - Update your repo files and push (do this FIRST, on your PC)</w:t>
+        <w:t>Step 0 - Repo files (already done)</w:t>
       </w:r>
     </w:p>
     <w:p>
       <w:r>
-        <w:t>Five changes switch the project to the SOP deployment method. Make them in your local repo, then push:</w:t>
+        <w:t>Your repo on main already has: the self-hosted ci.yml (name: Backend CI), the single axios config (frontend/src/axiosConfig.js with the live/local baseURL), the SOP nginx conf, and ec2-setup.sh. Nothing to change here yet - you set the live IP in Step 8.</w:t>
+      </w:r>
+    </w:p>
+    <w:p>
+      <w:pPr>
+        <w:pStyle w:val="Heading1"/>
+      </w:pPr>
+      <w:r>
+        <w:t>Step 1 - Launch the instance (t3.large)</w:t>
       </w:r>
     </w:p>
     <w:p>
@@ -82,7 +90,7 @@
         <w:pStyle w:val="ListBullet"/>
       </w:pPr>
       <w:r>
-        <w:t>.github/workflows/ci.yml - replace with the self-hosted-runner version (runs-on: self-hosted)</w:t>
+        <w:t>https://console.aws.amazon.com -&gt; region Asia Pacific (Sydney) ap-southeast-2 -&gt; EC2 -&gt; Launch instances.</w:t>
       </w:r>
     </w:p>
     <w:p>
@@ -90,7 +98,7 @@
         <w:pStyle w:val="ListBullet"/>
       </w:pPr>
       <w:r>
-        <w:t>scripts/nginx/restaurant-review.conf - SOP nginx (/ -&gt; :3000)</w:t>
+        <w:t>Name: restaurant-review-ec2.  AMI: Ubuntu Server 22.04 LTS.  Type: t3.large.</w:t>
       </w:r>
     </w:p>
     <w:p>
@@ -98,7 +106,7 @@
         <w:pStyle w:val="ListBullet"/>
       </w:pPr>
       <w:r>
-        <w:t>scripts/ec2-setup.sh - SOP base setup (nvm + Node 22 + pm2 + yarn + nginx)</w:t>
+        <w:t>Key pair: create mesa-key (RSA, .pem) and download it.</w:t>
       </w:r>
     </w:p>
     <w:p>
@@ -106,7 +114,20 @@
         <w:pStyle w:val="ListBullet"/>
       </w:pPr>
       <w:r>
-        <w:t>frontend/src/axiosConfig.jsx - now the single axios config (has the auth-token interceptor)</w:t>
+        <w:t>Network: Allow SSH (22) from My IP, and Allow HTTP (80) from the internet. Launch.</w:t>
+      </w:r>
+    </w:p>
+    <w:p>
+      <w:r>
+        <w:t>Wait for Running + 2/2 checks, then copy the Public IPv4 address.</w:t>
+      </w:r>
+    </w:p>
+    <w:p>
+      <w:pPr>
+        <w:pStyle w:val="Heading1"/>
+      </w:pPr>
+      <w:r>
+        <w:t>Step 2 - Open the security group ports</w:t>
       </w:r>
     </w:p>
     <w:p>
@@ -114,43 +135,7 @@
         <w:pStyle w:val="ListBullet"/>
       </w:pPr>
       <w:r>
-        <w:t>DELETE frontend/src/axiosConfig.js - the duplicate; CRA was using it instead of the .jsx</w:t>
-      </w:r>
-    </w:p>
-    <w:p>
-      <w:pPr>
-        <w:spacing w:after="120"/>
-        <w:ind w:left="240"/>
-      </w:pPr>
-      <w:r>
-        <w:rPr>
-          <w:rFonts w:ascii="Consolas" w:hAnsi="Consolas"/>
-          <w:sz w:val="18"/>
-        </w:rPr>
-        <w:t>git rm frontend/src/axiosConfig.js</w:t>
-        <w:br/>
-        <w:t>git add .github/workflows/ci.yml scripts/ec2-setup.sh scripts/nginx/restaurant-review.conf frontend/src/axiosConfig.jsx</w:t>
-        <w:br/>
-        <w:t>git commit -m "ci: switch to self-hosted runner deployment (SOP); merge axios config"</w:t>
-        <w:br/>
-        <w:t>git push</w:t>
-      </w:r>
-    </w:p>
-    <w:p>
-      <w:r>
-        <w:rPr>
-          <w:i/>
-          <w:color w:val="444444"/>
-        </w:rPr>
-        <w:t>This push queues a workflow run that just sits Queued until the self-hosted runner exists (Step 6). That is expected.</w:t>
-      </w:r>
-    </w:p>
-    <w:p>
-      <w:pPr>
-        <w:pStyle w:val="Heading1"/>
-      </w:pPr>
-      <w:r>
-        <w:t>Step 1 - AWS account + region</w:t>
+        <w:t>Instance -&gt; Security tab -&gt; the security group -&gt; Edit inbound rules -&gt; add:</w:t>
       </w:r>
     </w:p>
     <w:p>
@@ -158,7 +143,7 @@
         <w:pStyle w:val="ListBullet"/>
       </w:pPr>
       <w:r>
-        <w:t>Log in at https://console.aws.amazon.com (your own free-tier-enabled account).</w:t>
+        <w:t>SSH  - TCP 22   - My IP</w:t>
       </w:r>
     </w:p>
     <w:p>
@@ -166,7 +151,7 @@
         <w:pStyle w:val="ListBullet"/>
       </w:pPr>
       <w:r>
-        <w:t>Top-right region selector -&gt; Asia Pacific (Sydney) ap-southeast-2.</w:t>
+        <w:t>HTTP - TCP 80   - 0.0.0.0/0</w:t>
       </w:r>
     </w:p>
     <w:p>
@@ -174,124 +159,13 @@
         <w:pStyle w:val="ListBullet"/>
       </w:pPr>
       <w:r>
-        <w:t>Search EC2 -&gt; open the EC2 console.</w:t>
-      </w:r>
-    </w:p>
-    <w:p>
-      <w:pPr>
-        <w:pStyle w:val="Heading1"/>
-      </w:pPr>
-      <w:r>
-        <w:t>Step 2 - Launch the instance (t3.large)</w:t>
+        <w:t>Custom TCP - TCP 5001 - 0.0.0.0/0  (browser -&gt; backend API)</w:t>
       </w:r>
     </w:p>
     <w:p>
       <w:pPr>
         <w:pStyle w:val="ListBullet"/>
       </w:pPr>
-      <w:r>
-        <w:t>EC2 -&gt; Instances -&gt; Launch instances.</w:t>
-      </w:r>
-    </w:p>
-    <w:p>
-      <w:pPr>
-        <w:pStyle w:val="ListBullet"/>
-      </w:pPr>
-      <w:r>
-        <w:t>Name: restaurant-review-ec2.</w:t>
-      </w:r>
-    </w:p>
-    <w:p>
-      <w:pPr>
-        <w:pStyle w:val="ListBullet"/>
-      </w:pPr>
-      <w:r>
-        <w:t>AMI: Ubuntu Server 22.04 LTS.</w:t>
-      </w:r>
-    </w:p>
-    <w:p>
-      <w:pPr>
-        <w:pStyle w:val="ListBullet"/>
-      </w:pPr>
-      <w:r>
-        <w:t>Instance type: t3.large  (the SOP requires this - the React build needs the RAM).</w:t>
-      </w:r>
-    </w:p>
-    <w:p>
-      <w:pPr>
-        <w:pStyle w:val="ListBullet"/>
-      </w:pPr>
-      <w:r>
-        <w:t>Key pair: Create new key pair -&gt; name mesa-key -&gt; RSA -&gt; .pem -&gt; Download (keep it safe).</w:t>
-      </w:r>
-    </w:p>
-    <w:p>
-      <w:pPr>
-        <w:pStyle w:val="ListBullet"/>
-      </w:pPr>
-      <w:r>
-        <w:t>Network settings -&gt; Edit -&gt; Allow SSH (22) from My IP, and Allow HTTP (80) from the internet.</w:t>
-      </w:r>
-    </w:p>
-    <w:p>
-      <w:r>
-        <w:t>Launch the instance, then add the backend port to the security group (Step 4 below).</w:t>
-      </w:r>
-    </w:p>
-    <w:p>
-      <w:pPr>
-        <w:pStyle w:val="Heading1"/>
-      </w:pPr>
-      <w:r>
-        <w:t>Step 3 - Note the public IP</w:t>
-      </w:r>
-    </w:p>
-    <w:p>
-      <w:r>
-        <w:t>Instances -&gt; select yours -&gt; wait for Running + 2/2 status checks -&gt; copy the Public IPv4 address (e.g. 3.106.x.x). This is your public URL and the IP you put in axiosConfig.jsx.</w:t>
-      </w:r>
-    </w:p>
-    <w:p>
-      <w:pPr>
-        <w:pStyle w:val="Heading1"/>
-      </w:pPr>
-      <w:r>
-        <w:t>Step 4 - Open the security group ports</w:t>
-      </w:r>
-    </w:p>
-    <w:p>
-      <w:pPr>
-        <w:pStyle w:val="ListBullet"/>
-      </w:pPr>
-      <w:r>
-        <w:t>Instance -&gt; Security tab -&gt; click the security group -&gt; Edit inbound rules -&gt; Add rule for each:</w:t>
-      </w:r>
-    </w:p>
-    <w:p>
-      <w:pPr>
-        <w:pStyle w:val="ListBullet"/>
-      </w:pPr>
-      <w:r>
-        <w:t>SSH - TCP 22 - My IP</w:t>
-      </w:r>
-    </w:p>
-    <w:p>
-      <w:pPr>
-        <w:pStyle w:val="ListBullet"/>
-      </w:pPr>
-      <w:r>
-        <w:t>HTTP - TCP 80 - 0.0.0.0/0</w:t>
-      </w:r>
-    </w:p>
-    <w:p>
-      <w:pPr>
-        <w:pStyle w:val="ListBullet"/>
-      </w:pPr>
-      <w:r>
-        <w:t>Custom TCP - TCP 5001 - 0.0.0.0/0  (so the browser can reach the backend API)</w:t>
-      </w:r>
-    </w:p>
-    <w:p>
       <w:r>
         <w:t>Save rules.</w:t>
       </w:r>
@@ -301,41 +175,17 @@
         <w:pStyle w:val="Heading1"/>
       </w:pPr>
       <w:r>
-        <w:t>Step 5 - Connect + install the base toolchain</w:t>
+        <w:t>Step 3 - Connect + install the toolchain</w:t>
       </w:r>
     </w:p>
     <w:p>
       <w:r>
-        <w:t>Connect: EC2 -&gt; select instance -&gt; Connect -&gt; EC2 Instance Connect -&gt; Connect (browser terminal).</w:t>
+        <w:t>Connect: EC2 -&gt; select instance -&gt; Connect -&gt; EC2 Instance Connect -&gt; Connect.</w:t>
       </w:r>
     </w:p>
     <w:p>
       <w:r>
-        <w:t>Clone your repo and run the base setup script (installs nginx, Node 22 via nvm, pm2, yarn, nginx site):</w:t>
-      </w:r>
-    </w:p>
-    <w:p>
-      <w:pPr>
-        <w:spacing w:after="120"/>
-        <w:ind w:left="240"/>
-      </w:pPr>
-      <w:r>
-        <w:rPr>
-          <w:rFonts w:ascii="Consolas" w:hAnsi="Consolas"/>
-          <w:sz w:val="18"/>
-        </w:rPr>
-        <w:t>git clone https://github.com/david1carver/restaurant-review-platform.git</w:t>
-        <w:br/>
-        <w:t>cd restaurant-review-platform</w:t>
-        <w:br/>
-        <w:t>chmod +x scripts/ec2-setup.sh</w:t>
-        <w:br/>
-        <w:t>./scripts/ec2-setup.sh</w:t>
-      </w:r>
-    </w:p>
-    <w:p>
-      <w:r>
-        <w:t>If you prefer to do it by hand (matches the SOP exactly), run these instead of the script:</w:t>
+        <w:t>Install nginx + Node 22 (nvm) + pm2 + yarn, and expose them on the system PATH so the runner service can find them:</w:t>
       </w:r>
     </w:p>
     <w:p>
@@ -359,11 +209,15 @@
         <w:t>node --version</w:t>
         <w:br/>
         <w:t>npm install -g pm2 yarn</w:t>
+        <w:br/>
+        <w:t># expose tools to the systemd-run runner service:</w:t>
+        <w:br/>
+        <w:t>for t in node npm npx pm2 yarn; do sudo ln -sf "$(command -v $t)" /usr/local/bin/$t; done</w:t>
       </w:r>
     </w:p>
     <w:p>
       <w:r>
-        <w:t>Then set the nginx site and restart it:</w:t>
+        <w:t>Configure nginx to serve the app on :80 (proxy to the frontend on :3000):</w:t>
       </w:r>
     </w:p>
     <w:p>
@@ -376,16 +230,31 @@
           <w:rFonts w:ascii="Consolas" w:hAnsi="Consolas"/>
           <w:sz w:val="18"/>
         </w:rPr>
-        <w:t>sudo cp ~/restaurant-review-platform/scripts/nginx/restaurant-review.conf /etc/nginx/sites-available/default</w:t>
+        <w:t>sudo tee /etc/nginx/sites-available/default &gt; /dev/null &lt;&lt;'NGINX'</w:t>
         <w:br/>
-        <w:t>sudo nginx -t</w:t>
+        <w:t>server {</w:t>
         <w:br/>
-        <w:t>sudo service nginx restart</w:t>
-      </w:r>
-    </w:p>
-    <w:p>
-      <w:r>
-        <w:t>Visit http://&lt;public-ip&gt;/ - nginx is up if you get a 502 (frontend not started yet). We start the app via CI/CD shortly.</w:t>
+        <w:t xml:space="preserve">    listen 80;</w:t>
+        <w:br/>
+        <w:t xml:space="preserve">    server_name _;</w:t>
+        <w:br/>
+        <w:t xml:space="preserve">    location / {</w:t>
+        <w:br/>
+        <w:t xml:space="preserve">        proxy_pass http://localhost:3000;</w:t>
+        <w:br/>
+        <w:t xml:space="preserve">        proxy_set_header Host $host;</w:t>
+        <w:br/>
+        <w:t xml:space="preserve">        proxy_set_header X-Real-IP $remote_addr;</w:t>
+        <w:br/>
+        <w:t xml:space="preserve">        proxy_set_header X-Forwarded-For $proxy_add_x_forwarded_for;</w:t>
+        <w:br/>
+        <w:t xml:space="preserve">    }</w:t>
+        <w:br/>
+        <w:t>}</w:t>
+        <w:br/>
+        <w:t>NGINX</w:t>
+        <w:br/>
+        <w:t>sudo nginx -t &amp;&amp; sudo service nginx restart</w:t>
       </w:r>
     </w:p>
     <w:p>
@@ -393,7 +262,7 @@
         <w:pStyle w:val="Heading1"/>
       </w:pPr>
       <w:r>
-        <w:t>Step 6 - Install the GitHub self-hosted runner (on the instance)</w:t>
+        <w:t>Step 4 - Install the GitHub self-hosted runner (on the instance)</w:t>
       </w:r>
     </w:p>
     <w:p>
@@ -401,7 +270,7 @@
         <w:pStyle w:val="ListBullet"/>
       </w:pPr>
       <w:r>
-        <w:t>On GitHub: repo -&gt; Settings -&gt; Actions -&gt; Runners -&gt; New self-hosted runner.</w:t>
+        <w:t>GitHub: repo -&gt; Settings -&gt; Actions -&gt; Runners -&gt; New self-hosted runner.</w:t>
       </w:r>
     </w:p>
     <w:p>
@@ -409,7 +278,7 @@
         <w:pStyle w:val="ListBullet"/>
       </w:pPr>
       <w:r>
-        <w:t>Runner image: Linux. Architecture: x64.</w:t>
+        <w:t>Runner image: Linux.  Architecture: x64.</w:t>
       </w:r>
     </w:p>
     <w:p>
@@ -417,7 +286,7 @@
         <w:pStyle w:val="ListBullet"/>
       </w:pPr>
       <w:r>
-        <w:t>Copy the Download and Configure commands GitHub shows and paste them into the EC2 terminal,</w:t>
+        <w:t>Paste the Download and Configure commands from GitHub into the EC2 terminal, one block at a time.</w:t>
       </w:r>
     </w:p>
     <w:p>
@@ -425,12 +294,12 @@
         <w:pStyle w:val="ListBullet"/>
       </w:pPr>
       <w:r>
-        <w:t>one block at a time. Run everything EXCEPT the final ./run.sh command.</w:t>
+        <w:t>Run everything EXCEPT the final ./run.sh.  Accept defaults (press Enter) at the prompts.</w:t>
       </w:r>
     </w:p>
     <w:p>
       <w:r>
-        <w:t>When config.sh asks for a runner group / name / labels, press Enter to accept defaults. Then install it as a service so it keeps running:</w:t>
+        <w:t>Install + start it as a service so it survives logout/reboot:</w:t>
       </w:r>
     </w:p>
     <w:p>
@@ -452,16 +321,7 @@
     </w:p>
     <w:p>
       <w:r>
-        <w:t>Back on GitHub (Settings -&gt; Actions -&gt; Runners) the runner should now show Idle (green).</w:t>
-      </w:r>
-    </w:p>
-    <w:p>
-      <w:r>
-        <w:rPr>
-          <w:i/>
-          <w:color w:val="444444"/>
-        </w:rPr>
-        <w:t>The runner runs as the ubuntu user, so it can see the Node 22 you installed via nvm. The workflow sources nvm in each step, so node/npm/yarn/pm2 are all found.</w:t>
+        <w:t>On GitHub (Settings -&gt; Actions -&gt; Runners) the runner should now show Idle (green).</w:t>
       </w:r>
     </w:p>
     <w:p>
@@ -469,7 +329,12 @@
         <w:pStyle w:val="Heading1"/>
       </w:pPr>
       <w:r>
-        <w:t>Step 7 - Add the PROD environment + secrets</w:t>
+        <w:t>Step 5 - Add the secrets</w:t>
+      </w:r>
+    </w:p>
+    <w:p>
+      <w:r>
+        <w:t>a) The MONGO_URI environment (used by the print + test steps):</w:t>
       </w:r>
     </w:p>
     <w:p>
@@ -477,7 +342,7 @@
         <w:pStyle w:val="ListBullet"/>
       </w:pPr>
       <w:r>
-        <w:t>Repo -&gt; Settings -&gt; Environments -&gt; New environment -&gt; name it PROD -&gt; Configure.</w:t>
+        <w:t>Repo -&gt; Settings -&gt; Environments -&gt; New environment -&gt; name it exactly MONGO_URI -&gt; Configure.</w:t>
       </w:r>
     </w:p>
     <w:p>
@@ -493,7 +358,7 @@
         <w:pStyle w:val="ListBullet"/>
       </w:pPr>
       <w:r>
-        <w:t>Add environment secret JWT_SECRET = your JWT secret (same as local).</w:t>
+        <w:t>Add environment secret JWT_SECRET = your JWT secret.</w:t>
       </w:r>
     </w:p>
     <w:p>
@@ -506,7 +371,158 @@
     </w:p>
     <w:p>
       <w:r>
-        <w:t>The SOP also adds a repository secret called PROD (Settings -&gt; Secrets and variables -&gt; Actions -&gt; New repository secret). Our workflow keys off the PROD environment above, so this repo secret is optional - add it (any value, e.g. true) if you want your screenshots to match the SOP exactly.</w:t>
+        <w:t>b) The PROD repository secret (the whole production .env file):</w:t>
+      </w:r>
+    </w:p>
+    <w:p>
+      <w:pPr>
+        <w:pStyle w:val="ListBullet"/>
+      </w:pPr>
+      <w:r>
+        <w:t>Repo -&gt; Settings -&gt; Secrets and variables -&gt; Actions -&gt; New repository secret.</w:t>
+      </w:r>
+    </w:p>
+    <w:p>
+      <w:pPr>
+        <w:pStyle w:val="ListBullet"/>
+      </w:pPr>
+      <w:r>
+        <w:t>Name: PROD.  Value: paste all three lines exactly:</w:t>
+      </w:r>
+    </w:p>
+    <w:p>
+      <w:pPr>
+        <w:spacing w:after="120"/>
+        <w:ind w:left="240"/>
+      </w:pPr>
+      <w:r>
+        <w:rPr>
+          <w:rFonts w:ascii="Consolas" w:hAnsi="Consolas"/>
+          <w:sz w:val="18"/>
+        </w:rPr>
+        <w:t>MONGO_URI=your-mongodb-atlas-connection-string</w:t>
+        <w:br/>
+        <w:t>JWT_SECRET=your-jwt-secret</w:t>
+        <w:br/>
+        <w:t>PORT=5001</w:t>
+      </w:r>
+    </w:p>
+    <w:p>
+      <w:r>
+        <w:rPr>
+          <w:i/>
+          <w:color w:val="444444"/>
+        </w:rPr>
+        <w:t>PROD is multi-line on purpose - the workflow writes it straight into backend/.env on the server.</w:t>
+      </w:r>
+    </w:p>
+    <w:p>
+      <w:pPr>
+        <w:pStyle w:val="Heading1"/>
+      </w:pPr>
+      <w:r>
+        <w:t>Step 6 - First push (builds the workspace)</w:t>
+      </w:r>
+    </w:p>
+    <w:p>
+      <w:r>
+        <w:t>On your PC, push any commit to main (or re-run the latest workflow). The run will go green; the pm2 step is tolerant on this first run because the app processes are not registered yet.</w:t>
+      </w:r>
+    </w:p>
+    <w:p>
+      <w:pPr>
+        <w:spacing w:after="120"/>
+        <w:ind w:left="240"/>
+      </w:pPr>
+      <w:r>
+        <w:rPr>
+          <w:rFonts w:ascii="Consolas" w:hAnsi="Consolas"/>
+          <w:sz w:val="18"/>
+        </w:rPr>
+        <w:t>git commit --allow-empty -m "ci: trigger first deploy build"</w:t>
+        <w:br/>
+        <w:t>git push origin main</w:t>
+      </w:r>
+    </w:p>
+    <w:p>
+      <w:r>
+        <w:t>This checks the project out on the instance under the runner workspace and builds the frontend there.</w:t>
+      </w:r>
+    </w:p>
+    <w:p>
+      <w:pPr>
+        <w:pStyle w:val="Heading1"/>
+      </w:pPr>
+      <w:r>
+        <w:t>Step 7 - Register the pm2 processes ONCE (on the instance)</w:t>
+      </w:r>
+    </w:p>
+    <w:p>
+      <w:r>
+        <w:t>Point pm2 at the runner workspace so future deploys update the running app. In the EC2 terminal:</w:t>
+      </w:r>
+    </w:p>
+    <w:p>
+      <w:pPr>
+        <w:spacing w:after="120"/>
+        <w:ind w:left="240"/>
+      </w:pPr>
+      <w:r>
+        <w:rPr>
+          <w:rFonts w:ascii="Consolas" w:hAnsi="Consolas"/>
+          <w:sz w:val="18"/>
+        </w:rPr>
+        <w:t>cd ~/actions-runner/_work/restaurant-review-platform/restaurant-review-platform</w:t>
+        <w:br/>
+        <w:t>pwd   # confirm you are in the project (you should see backend/ and frontend/)</w:t>
+        <w:br/>
+        <w:t># backend on :5001 (reads backend/.env written by the workflow)</w:t>
+        <w:br/>
+        <w:t>cd backend &amp;&amp; pm2 start npm --name backend -- start &amp;&amp; cd ..</w:t>
+        <w:br/>
+        <w:t># frontend build served on :3000</w:t>
+        <w:br/>
+        <w:t>pm2 serve frontend/build 3000 --name Frontend --spa</w:t>
+        <w:br/>
+        <w:t>pm2 save</w:t>
+      </w:r>
+    </w:p>
+    <w:p>
+      <w:r>
+        <w:t>Make pm2 start on reboot:</w:t>
+      </w:r>
+    </w:p>
+    <w:p>
+      <w:pPr>
+        <w:spacing w:after="120"/>
+        <w:ind w:left="240"/>
+      </w:pPr>
+      <w:r>
+        <w:rPr>
+          <w:rFonts w:ascii="Consolas" w:hAnsi="Consolas"/>
+          <w:sz w:val="18"/>
+        </w:rPr>
+        <w:t>pm2 startup systemd   # run the sudo ... line it prints, then:</w:t>
+        <w:br/>
+        <w:t>pm2 save</w:t>
+      </w:r>
+    </w:p>
+    <w:p>
+      <w:r>
+        <w:t>Check both are up:</w:t>
+      </w:r>
+    </w:p>
+    <w:p>
+      <w:pPr>
+        <w:spacing w:after="120"/>
+        <w:ind w:left="240"/>
+      </w:pPr>
+      <w:r>
+        <w:rPr>
+          <w:rFonts w:ascii="Consolas" w:hAnsi="Consolas"/>
+          <w:sz w:val="18"/>
+        </w:rPr>
+        <w:t>pm2 status   # expect: backend (online) and Frontend (online)</w:t>
       </w:r>
     </w:p>
     <w:p>
@@ -519,7 +535,7 @@
     </w:p>
     <w:p>
       <w:r>
-        <w:t>Edit frontend/src/axiosConfig.jsx in your local repo: comment the localhost line and uncomment the live line, replacing the IP with YOUR public IPv4:</w:t>
+        <w:t>In your local repo edit frontend/src/axiosConfig.js: comment the localhost line, uncomment the live line and set YOUR public IP:</w:t>
       </w:r>
     </w:p>
     <w:p>
@@ -538,11 +554,6 @@
       </w:r>
     </w:p>
     <w:p>
-      <w:r>
-        <w:t>Commit and push to main (no feature branch this time):</w:t>
-      </w:r>
-    </w:p>
-    <w:p>
       <w:pPr>
         <w:spacing w:after="120"/>
         <w:ind w:left="240"/>
@@ -552,9 +563,7 @@
           <w:rFonts w:ascii="Consolas" w:hAnsi="Consolas"/>
           <w:sz w:val="18"/>
         </w:rPr>
-        <w:t>git checkout main</w:t>
-        <w:br/>
-        <w:t>git add frontend/src/axiosConfig.jsx</w:t>
+        <w:t>git add frontend/src/axiosConfig.js</w:t>
         <w:br/>
         <w:t>git commit -m "config: set live API base URL to EC2 public IP"</w:t>
         <w:br/>
@@ -562,75 +571,8 @@
       </w:r>
     </w:p>
     <w:p>
-      <w:pPr>
-        <w:pStyle w:val="Heading1"/>
-      </w:pPr>
       <w:r>
-        <w:t>Step 9 - Watch the pipeline deploy</w:t>
-      </w:r>
-    </w:p>
-    <w:p>
-      <w:pPr>
-        <w:pStyle w:val="ListBullet"/>
-      </w:pPr>
-      <w:r>
-        <w:t>Repo -&gt; Actions -&gt; open the latest run.</w:t>
-      </w:r>
-    </w:p>
-    <w:p>
-      <w:pPr>
-        <w:pStyle w:val="ListBullet"/>
-      </w:pPr>
-      <w:r>
-        <w:t>Run unit tests (self-hosted) -&gt; green.</w:t>
-      </w:r>
-    </w:p>
-    <w:p>
-      <w:pPr>
-        <w:pStyle w:val="ListBullet"/>
-      </w:pPr>
-      <w:r>
-        <w:t>Deploy to EC2 (self-hosted) -&gt; green: it writes .env, restarts the backend, builds + serves the frontend, and saves pm2.</w:t>
-      </w:r>
-    </w:p>
-    <w:p>
-      <w:r>
-        <w:t>On the EC2 terminal, confirm both processes are online:</w:t>
-      </w:r>
-    </w:p>
-    <w:p>
-      <w:pPr>
-        <w:spacing w:after="120"/>
-        <w:ind w:left="240"/>
-      </w:pPr>
-      <w:r>
-        <w:rPr>
-          <w:rFonts w:ascii="Consolas" w:hAnsi="Consolas"/>
-          <w:sz w:val="18"/>
-        </w:rPr>
-        <w:t>export NVM_DIR="$HOME/.nvm"; . "$NVM_DIR/nvm.sh"</w:t>
-        <w:br/>
-        <w:t>pm2 status</w:t>
-      </w:r>
-    </w:p>
-    <w:p>
-      <w:r>
-        <w:t>You should see backend and Frontend both online. To make them survive a reboot:</w:t>
-      </w:r>
-    </w:p>
-    <w:p>
-      <w:pPr>
-        <w:spacing w:after="120"/>
-        <w:ind w:left="240"/>
-      </w:pPr>
-      <w:r>
-        <w:rPr>
-          <w:rFonts w:ascii="Consolas" w:hAnsi="Consolas"/>
-          <w:sz w:val="18"/>
-        </w:rPr>
-        <w:t>pm2 save</w:t>
-        <w:br/>
-        <w:t>pm2 startup systemd   # run the sudo ... line it prints, then: pm2 save</w:t>
+        <w:t>The runner rebuilds the frontend (now baked with your IP) and pm2 restart all serves it. Refresh http://&lt;public-ip&gt;/ - the app should talk to the backend.</w:t>
       </w:r>
     </w:p>
     <w:p>
@@ -638,7 +580,7 @@
         <w:pStyle w:val="Heading1"/>
       </w:pPr>
       <w:r>
-        <w:t>Step 10 - Open the app + capture the report evidence (7.1-7.4)</w:t>
+        <w:t>Step 9 - Open the app + capture evidence (7.1-7.4)</w:t>
       </w:r>
     </w:p>
     <w:p>
@@ -654,7 +596,7 @@
         <w:pStyle w:val="ListBullet"/>
       </w:pPr>
       <w:r>
-        <w:t>7.1 - screenshot .github/workflows/ci.yml (the self-hosted-runner pipeline).</w:t>
+        <w:t>7.1 - screenshot .github/workflows/ci.yml.</w:t>
       </w:r>
     </w:p>
     <w:p>
@@ -662,7 +604,7 @@
         <w:pStyle w:val="ListBullet"/>
       </w:pPr>
       <w:r>
-        <w:t>7.2 - screenshot pm2 status showing backend + Frontend online.</w:t>
+        <w:t>7.2 - screenshot pm2 status (backend + Frontend online).</w:t>
       </w:r>
     </w:p>
     <w:p>
@@ -670,7 +612,7 @@
         <w:pStyle w:val="ListBullet"/>
       </w:pPr>
       <w:r>
-        <w:t>7.3 - screenshot the green Actions run (test + deploy jobs) AND Settings -&gt; Actions -&gt; Runners showing your self-hosted runner.</w:t>
+        <w:t>7.3 - screenshot the green Actions run AND Settings -&gt; Actions -&gt; Runners showing your runner.</w:t>
       </w:r>
     </w:p>
     <w:p>
@@ -678,12 +620,12 @@
         <w:pStyle w:val="ListBullet"/>
       </w:pPr>
       <w:r>
-        <w:t>7.4 - screenshot the app in the browser with the public IP visible in the address bar.</w:t>
+        <w:t>7.4 - screenshot the app in the browser with the public IP in the address bar.</w:t>
       </w:r>
     </w:p>
     <w:p>
       <w:r>
-        <w:t>Put the public URL on the report cover, in 7.4, and in Part C. Tell me the IP and I will update the report and reframe 7 from constraint to a working self-hosted-runner deployment.</w:t>
+        <w:t>Send me the public IP and I will update the report cover, 7, and Part C, and reframe 7 from constraint to a working self-hosted-runner deployment.</w:t>
       </w:r>
     </w:p>
     <w:p>
@@ -699,7 +641,7 @@
         <w:pStyle w:val="ListBullet"/>
       </w:pPr>
       <w:r>
-        <w:t>Workflow stuck Queued -&gt; the runner is not Idle. On the box: sudo ./svc.sh status; sudo ./svc.sh start.</w:t>
+        <w:t>Workflow Queued forever -&gt; runner not Idle: sudo ./svc.sh status; sudo ./svc.sh start.</w:t>
       </w:r>
     </w:p>
     <w:p>
@@ -707,7 +649,7 @@
         <w:pStyle w:val="ListBullet"/>
       </w:pPr>
       <w:r>
-        <w:t>Deploy step pm2: command not found -&gt; the runner cannot see nvm. Confirm node was installed for the ubuntu user (ls ~/.nvm) and re-run the job.</w:t>
+        <w:t>pm2: command not found in the job -&gt; re-run the symlink loop in Step 3 (for t in node npm npx pm2 yarn ...).</w:t>
       </w:r>
     </w:p>
     <w:p>
@@ -715,7 +657,7 @@
         <w:pStyle w:val="ListBullet"/>
       </w:pPr>
       <w:r>
-        <w:t>App loads but API calls fail -&gt; axiosConfig.jsx live IP wrong, or port 5001 not open in the security group. Test the API directly: http://&lt;public-ip&gt;:5001/api/health -&gt; {"status":"OK"}.</w:t>
+        <w:t>npm ci step fails -&gt; run it once on the box in the workspace root to sync, or tell me and I will relax it.</w:t>
       </w:r>
     </w:p>
     <w:p>
@@ -723,7 +665,7 @@
         <w:pStyle w:val="ListBullet"/>
       </w:pPr>
       <w:r>
-        <w:t>yarn build runs out of memory -&gt; you launched a smaller instance than t3.large. Resize it.</w:t>
+        <w:t>App loads but API fails -&gt; wrong live IP in axiosConfig.js, or port 5001 not open. Test http://&lt;public-ip&gt;:5001/api/health -&gt; {"status":"OK"}.</w:t>
       </w:r>
     </w:p>
     <w:p>
@@ -731,7 +673,7 @@
         <w:pStyle w:val="ListBullet"/>
       </w:pPr>
       <w:r>
-        <w:t>nginx 502 -&gt; the frontend pm2 process is not up yet; re-run the deploy job.</w:t>
+        <w:t>yarn build out of memory -&gt; instance smaller than t3.large; resize it.</w:t>
       </w:r>
     </w:p>
     <w:p>
@@ -739,7 +681,15 @@
         <w:pStyle w:val="ListBullet"/>
       </w:pPr>
       <w:r>
-        <w:t>Cost -&gt; STOP or TERMINATE the t3.large when finished. The public IP changes on stop/start unless you attach an Elastic IP (free while attached to a running instance).</w:t>
+        <w:t>nginx 502 -&gt; Frontend pm2 process not up; redo Step 7 or pm2 restart Frontend.</w:t>
+      </w:r>
+    </w:p>
+    <w:p>
+      <w:pPr>
+        <w:pStyle w:val="ListBullet"/>
+      </w:pPr>
+      <w:r>
+        <w:t>Cost -&gt; STOP/TERMINATE the t3.large when done. Public IP changes on stop/start unless you attach an Elastic IP.</w:t>
       </w:r>
     </w:p>
     <w:sectPr>

</xml_diff>

<commit_message>
docs(a2): switch deploy guide to QUT student AWS account (t3.medium, IFQ636-EC2-Role, PublicSubnet)
</commit_message>
<xml_diff>
--- a/docs/A2/EC2_Deploy_Guide.docx
+++ b/docs/A2/EC2_Deploy_Guide.docx
@@ -7,12 +7,12 @@
         <w:pStyle w:val="Title"/>
       </w:pPr>
       <w:r>
-        <w:t>IFQ636 A2 - Deploy to AWS EC2 (self-hosted runner, per unit SOP)</w:t>
+        <w:t>IFQ636 A2 - Deploy to EC2 (QUT student account + self-hosted runner)</w:t>
       </w:r>
     </w:p>
     <w:p>
       <w:r>
-        <w:t>This matches the unit SOP. A GitHub Actions self-hosted runner installed ON the EC2 instance runs one "Run Tests" job on every push to main: it stops the app, installs deps, builds the frontend (yarn), runs the unit tests, writes the production .env from the PROD secret, then restarts the backend + frontend under pm2. nginx serves the app on port 80.</w:t>
+        <w:t>This follows the unit SOPs. You launch an Ubuntu EC2 instance in the QUT student AWS account, install a GitHub Actions self-hosted runner on it, and let the "Backend CI" workflow deploy on every push to main: stop the app, install deps, build the frontend (yarn), run the unit tests, write the production .env from the PROD secret, then restart the backend + frontend under pm2. nginx serves the app on port 80.</w:t>
       </w:r>
     </w:p>
     <w:p>
@@ -21,7 +21,7 @@
           <w:i/>
           <w:color w:val="444444"/>
         </w:rPr>
-        <w:t>Use your OWN AWS account. The SOP needs a t3.large (NOT free tier, ~US$0.075/hr) - the React build runs on the box. Launch it, capture evidence, then STOP/TERMINATE it the same day. Budget ~75-90 min the first time.</w:t>
+        <w:t>Use the QUT student AWS account (free). The instance public IP CHANGES if you stop/start it, and axiosConfig.js bakes the IP into the build - so keep the instance RUNNING from Step 8 (set live IP) through capturing your evidence and recording the video. Tag the instance with your student ID so you can find it.</w:t>
       </w:r>
     </w:p>
     <w:p>
@@ -37,7 +37,7 @@
         <w:pStyle w:val="ListBullet"/>
       </w:pPr>
       <w:r>
-        <w:t>Browser -&gt; http://&lt;public-ip&gt;/  -&gt; nginx (:80) -&gt; React SPA served by pm2 "Frontend" (:3000)</w:t>
+        <w:t>Browser -&gt; http://&lt;public-ip&gt;/  -&gt; nginx (:80) -&gt; React SPA via pm2 "Frontend" (:3000)</w:t>
       </w:r>
     </w:p>
     <w:p>
@@ -61,7 +61,7 @@
         <w:pStyle w:val="ListBullet"/>
       </w:pPr>
       <w:r>
-        <w:t>Secrets: environment "MONGO_URI" holds MONGO_URI/JWT_SECRET/PORT (for the test step); repository secret PROD holds the whole .env file (for production)</w:t>
+        <w:t>Secrets: environment "MONGO_URI" holds MONGO_URI/JWT_SECRET/PORT (test step); repository secret PROD holds the whole .env file (production)</w:t>
       </w:r>
     </w:p>
     <w:p>
@@ -69,20 +69,7 @@
         <w:pStyle w:val="Heading1"/>
       </w:pPr>
       <w:r>
-        <w:t>Step 0 - Repo files (already done)</w:t>
-      </w:r>
-    </w:p>
-    <w:p>
-      <w:r>
-        <w:t>Your repo on main already has: the self-hosted ci.yml (name: Backend CI), the single axios config (frontend/src/axiosConfig.js with the live/local baseURL), the SOP nginx conf, and ec2-setup.sh. Nothing to change here yet - you set the live IP in Step 8.</w:t>
-      </w:r>
-    </w:p>
-    <w:p>
-      <w:pPr>
-        <w:pStyle w:val="Heading1"/>
-      </w:pPr>
-      <w:r>
-        <w:t>Step 1 - Launch the instance (t3.large)</w:t>
+        <w:t>Step 1 - Launch the instance (QUT student account)</w:t>
       </w:r>
     </w:p>
     <w:p>
@@ -90,7 +77,7 @@
         <w:pStyle w:val="ListBullet"/>
       </w:pPr>
       <w:r>
-        <w:t>https://console.aws.amazon.com -&gt; region Asia Pacific (Sydney) ap-southeast-2 -&gt; EC2 -&gt; Launch instances.</w:t>
+        <w:t>Open https://d-97671c4bd0.awsapps.com/start and sign in with your QUT credentials.</w:t>
       </w:r>
     </w:p>
     <w:p>
@@ -98,7 +85,7 @@
         <w:pStyle w:val="ListBullet"/>
       </w:pPr>
       <w:r>
-        <w:t>Name: restaurant-review-ec2.  AMI: Ubuntu Server 22.04 LTS.  Type: t3.large.</w:t>
+        <w:t>Choose the IFQ636-STUDENT role -&gt; opens the AWS console.</w:t>
       </w:r>
     </w:p>
     <w:p>
@@ -106,7 +93,7 @@
         <w:pStyle w:val="ListBullet"/>
       </w:pPr>
       <w:r>
-        <w:t>Key pair: create mesa-key (RSA, .pem) and download it.</w:t>
+        <w:t>Top-right region -&gt; Asia Pacific (Sydney) ap-southeast-2.</w:t>
       </w:r>
     </w:p>
     <w:p>
@@ -114,12 +101,68 @@
         <w:pStyle w:val="ListBullet"/>
       </w:pPr>
       <w:r>
-        <w:t>Network: Allow SSH (22) from My IP, and Allow HTTP (80) from the internet. Launch.</w:t>
+        <w:t>Search EC2 -&gt; Launch instances.</w:t>
+      </w:r>
+    </w:p>
+    <w:p>
+      <w:pPr>
+        <w:pStyle w:val="ListBullet"/>
+      </w:pPr>
+      <w:r>
+        <w:t>Name and Tags: leave blank for now (name it after it launches).</w:t>
+      </w:r>
+    </w:p>
+    <w:p>
+      <w:pPr>
+        <w:pStyle w:val="ListBullet"/>
+      </w:pPr>
+      <w:r>
+        <w:t>AMI: Ubuntu Server 22.04 LTS.</w:t>
+      </w:r>
+    </w:p>
+    <w:p>
+      <w:pPr>
+        <w:pStyle w:val="ListBullet"/>
+      </w:pPr>
+      <w:r>
+        <w:t>Instance type: t3.medium  (t2.micro cannot build the React frontend; do not pick larger than t3.medium/large or the launch may fail on the student account).</w:t>
+      </w:r>
+    </w:p>
+    <w:p>
+      <w:pPr>
+        <w:pStyle w:val="ListBullet"/>
+      </w:pPr>
+      <w:r>
+        <w:t>Key pair: Create new key pair -&gt; name e.g. mesa-key -&gt; Windows: .ppk (PuTTY) or .pem (OpenSSH); Mac/Linux: .pem -&gt; Download and keep it safe.</w:t>
+      </w:r>
+    </w:p>
+    <w:p>
+      <w:pPr>
+        <w:pStyle w:val="ListBullet"/>
+      </w:pPr>
+      <w:r>
+        <w:t>Network settings -&gt; Edit -&gt; Subnet: choose PublicSubnet1 or PublicSubnet2; select all the (student-allowed) security groups.</w:t>
+      </w:r>
+    </w:p>
+    <w:p>
+      <w:pPr>
+        <w:pStyle w:val="ListBullet"/>
+      </w:pPr>
+      <w:r>
+        <w:t>Advanced details -&gt; IAM instance profile -&gt; IFQ636-EC2-Role.</w:t>
+      </w:r>
+    </w:p>
+    <w:p>
+      <w:pPr>
+        <w:pStyle w:val="ListBullet"/>
+      </w:pPr>
+      <w:r>
+        <w:t>Launch instance. Note your Instance ID (you share the account with other students).</w:t>
       </w:r>
     </w:p>
     <w:p>
       <w:r>
-        <w:t>Wait for Running + 2/2 checks, then copy the Public IPv4 address.</w:t>
+        <w:t>Open the instance, give it a Name (your student ID), then copy its Public IPv4 address.</w:t>
       </w:r>
     </w:p>
     <w:p>
@@ -131,11 +174,8 @@
       </w:r>
     </w:p>
     <w:p>
-      <w:pPr>
-        <w:pStyle w:val="ListBullet"/>
-      </w:pPr>
       <w:r>
-        <w:t>Instance -&gt; Security tab -&gt; the security group -&gt; Edit inbound rules -&gt; add:</w:t>
+        <w:t>Instance -&gt; Security tab -&gt; click a student-allowed / SelfManaged security group -&gt; Edit inbound rules -&gt; Add rule for each (then Save):</w:t>
       </w:r>
     </w:p>
     <w:p>
@@ -143,7 +183,7 @@
         <w:pStyle w:val="ListBullet"/>
       </w:pPr>
       <w:r>
-        <w:t>SSH  - TCP 22   - My IP</w:t>
+        <w:t>SSH - TCP 22 - My IP</w:t>
       </w:r>
     </w:p>
     <w:p>
@@ -151,7 +191,7 @@
         <w:pStyle w:val="ListBullet"/>
       </w:pPr>
       <w:r>
-        <w:t>HTTP - TCP 80   - 0.0.0.0/0</w:t>
+        <w:t>HTTP - TCP 80 - 0.0.0.0/0   (browser -&gt; app)</w:t>
       </w:r>
     </w:p>
     <w:p>
@@ -159,15 +199,16 @@
         <w:pStyle w:val="ListBullet"/>
       </w:pPr>
       <w:r>
-        <w:t>Custom TCP - TCP 5001 - 0.0.0.0/0  (browser -&gt; backend API)</w:t>
+        <w:t>Custom TCP - TCP 5001 - 0.0.0.0/0   (browser -&gt; backend API)</w:t>
       </w:r>
     </w:p>
     <w:p>
-      <w:pPr>
-        <w:pStyle w:val="ListBullet"/>
-      </w:pPr>
       <w:r>
-        <w:t>Save rules.</w:t>
+        <w:rPr>
+          <w:i/>
+          <w:color w:val="444444"/>
+        </w:rPr>
+        <w:t>If you are off the QUT network, you must add your computer IP (My IP) for SSH or you cannot connect.</w:t>
       </w:r>
     </w:p>
     <w:p>
@@ -175,12 +216,60 @@
         <w:pStyle w:val="Heading1"/>
       </w:pPr>
       <w:r>
-        <w:t>Step 3 - Connect + install the toolchain</w:t>
+        <w:t>Step 3 - Connect by SSH</w:t>
       </w:r>
     </w:p>
     <w:p>
       <w:r>
-        <w:t>Connect: EC2 -&gt; select instance -&gt; Connect -&gt; EC2 Instance Connect -&gt; Connect.</w:t>
+        <w:t>Windows (OpenSSH) - in PowerShell from where your .pem is:</w:t>
+      </w:r>
+    </w:p>
+    <w:p>
+      <w:pPr>
+        <w:spacing w:after="120"/>
+        <w:ind w:left="240"/>
+      </w:pPr>
+      <w:r>
+        <w:rPr>
+          <w:rFonts w:ascii="Consolas" w:hAnsi="Consolas"/>
+          <w:sz w:val="18"/>
+        </w:rPr>
+        <w:t>ssh -i mesa-key.pem ubuntu@&lt;PUBLIC_IP&gt;</w:t>
+        <w:br/>
+        <w:t># type yes at the prompt</w:t>
+      </w:r>
+    </w:p>
+    <w:p>
+      <w:r>
+        <w:t>Windows (PuTTY) - enter the public IP; SSH -&gt; Auth -&gt; Credentials -&gt; browse to your .ppk -&gt; Open; login as ubuntu.</w:t>
+      </w:r>
+    </w:p>
+    <w:p>
+      <w:r>
+        <w:t>Mac/Linux:</w:t>
+      </w:r>
+    </w:p>
+    <w:p>
+      <w:pPr>
+        <w:spacing w:after="120"/>
+        <w:ind w:left="240"/>
+      </w:pPr>
+      <w:r>
+        <w:rPr>
+          <w:rFonts w:ascii="Consolas" w:hAnsi="Consolas"/>
+          <w:sz w:val="18"/>
+        </w:rPr>
+        <w:t>chmod 400 mesa-key.pem</w:t>
+        <w:br/>
+        <w:t>ssh -i mesa-key.pem ubuntu@&lt;PUBLIC_IP&gt;</w:t>
+      </w:r>
+    </w:p>
+    <w:p>
+      <w:pPr>
+        <w:pStyle w:val="Heading1"/>
+      </w:pPr>
+      <w:r>
+        <w:t>Step 4 - Install the toolchain</w:t>
       </w:r>
     </w:p>
     <w:p>
@@ -209,8 +298,6 @@
         <w:t>node --version</w:t>
         <w:br/>
         <w:t>npm install -g pm2 yarn</w:t>
-        <w:br/>
-        <w:t># expose tools to the systemd-run runner service:</w:t>
         <w:br/>
         <w:t>for t in node npm npx pm2 yarn; do sudo ln -sf "$(command -v $t)" /usr/local/bin/$t; done</w:t>
       </w:r>
@@ -262,7 +349,7 @@
         <w:pStyle w:val="Heading1"/>
       </w:pPr>
       <w:r>
-        <w:t>Step 4 - Install the GitHub self-hosted runner (on the instance)</w:t>
+        <w:t>Step 5 - Install the GitHub self-hosted runner (on the instance)</w:t>
       </w:r>
     </w:p>
     <w:p>
@@ -294,12 +381,7 @@
         <w:pStyle w:val="ListBullet"/>
       </w:pPr>
       <w:r>
-        <w:t>Run everything EXCEPT the final ./run.sh.  Accept defaults (press Enter) at the prompts.</w:t>
-      </w:r>
-    </w:p>
-    <w:p>
-      <w:r>
-        <w:t>Install + start it as a service so it survives logout/reboot:</w:t>
+        <w:t>Run everything EXCEPT the final ./run.sh.  Accept defaults (Enter) at the prompts.</w:t>
       </w:r>
     </w:p>
     <w:p>
@@ -321,7 +403,7 @@
     </w:p>
     <w:p>
       <w:r>
-        <w:t>On GitHub (Settings -&gt; Actions -&gt; Runners) the runner should now show Idle (green).</w:t>
+        <w:t>On GitHub (Settings -&gt; Actions -&gt; Runners) the runner should show Idle (green).</w:t>
       </w:r>
     </w:p>
     <w:p>
@@ -329,12 +411,12 @@
         <w:pStyle w:val="Heading1"/>
       </w:pPr>
       <w:r>
-        <w:t>Step 5 - Add the secrets</w:t>
+        <w:t>Step 6 - Add the secrets</w:t>
       </w:r>
     </w:p>
     <w:p>
       <w:r>
-        <w:t>a) The MONGO_URI environment (used by the print + test steps):</w:t>
+        <w:t>a) Environment MONGO_URI (used by the print + test steps):</w:t>
       </w:r>
     </w:p>
     <w:p>
@@ -350,28 +432,12 @@
         <w:pStyle w:val="ListBullet"/>
       </w:pPr>
       <w:r>
-        <w:t>Add environment secret MONGO_URI = your MongoDB Atlas connection string.</w:t>
-      </w:r>
-    </w:p>
-    <w:p>
-      <w:pPr>
-        <w:pStyle w:val="ListBullet"/>
-      </w:pPr>
-      <w:r>
-        <w:t>Add environment secret JWT_SECRET = your JWT secret.</w:t>
-      </w:r>
-    </w:p>
-    <w:p>
-      <w:pPr>
-        <w:pStyle w:val="ListBullet"/>
-      </w:pPr>
-      <w:r>
-        <w:t>Add environment secret PORT = 5001.</w:t>
+        <w:t>Add environment secrets: MONGO_URI = your Atlas string, JWT_SECRET = your secret, PORT = 5001.</w:t>
       </w:r>
     </w:p>
     <w:p>
       <w:r>
-        <w:t>b) The PROD repository secret (the whole production .env file):</w:t>
+        <w:t>b) Repository secret PROD (the whole production .env):</w:t>
       </w:r>
     </w:p>
     <w:p>
@@ -408,25 +474,16 @@
       </w:r>
     </w:p>
     <w:p>
-      <w:r>
-        <w:rPr>
-          <w:i/>
-          <w:color w:val="444444"/>
-        </w:rPr>
-        <w:t>PROD is multi-line on purpose - the workflow writes it straight into backend/.env on the server.</w:t>
-      </w:r>
-    </w:p>
-    <w:p>
       <w:pPr>
         <w:pStyle w:val="Heading1"/>
       </w:pPr>
       <w:r>
-        <w:t>Step 6 - First push (builds the workspace)</w:t>
+        <w:t>Step 7 - First push (builds the workspace) + register pm2 once</w:t>
       </w:r>
     </w:p>
     <w:p>
       <w:r>
-        <w:t>On your PC, push any commit to main (or re-run the latest workflow). The run will go green; the pm2 step is tolerant on this first run because the app processes are not registered yet.</w:t>
+        <w:t>On your PC, push to main to trigger the workflow (it builds the frontend on the box):</w:t>
       </w:r>
     </w:p>
     <w:p>
@@ -446,20 +503,7 @@
     </w:p>
     <w:p>
       <w:r>
-        <w:t>This checks the project out on the instance under the runner workspace and builds the frontend there.</w:t>
-      </w:r>
-    </w:p>
-    <w:p>
-      <w:pPr>
-        <w:pStyle w:val="Heading1"/>
-      </w:pPr>
-      <w:r>
-        <w:t>Step 7 - Register the pm2 processes ONCE (on the instance)</w:t>
-      </w:r>
-    </w:p>
-    <w:p>
-      <w:r>
-        <w:t>Point pm2 at the runner workspace so future deploys update the running app. In the EC2 terminal:</w:t>
+        <w:t>Then, on the EC2 terminal, register the pm2 processes pointing at the runner workspace (one time):</w:t>
       </w:r>
     </w:p>
     <w:p>
@@ -474,55 +518,15 @@
         </w:rPr>
         <w:t>cd ~/actions-runner/_work/restaurant-review-platform/restaurant-review-platform</w:t>
         <w:br/>
-        <w:t>pwd   # confirm you are in the project (you should see backend/ and frontend/)</w:t>
-        <w:br/>
-        <w:t># backend on :5001 (reads backend/.env written by the workflow)</w:t>
-        <w:br/>
         <w:t>cd backend &amp;&amp; pm2 start npm --name backend -- start &amp;&amp; cd ..</w:t>
-        <w:br/>
-        <w:t># frontend build served on :3000</w:t>
         <w:br/>
         <w:t>pm2 serve frontend/build 3000 --name Frontend --spa</w:t>
         <w:br/>
         <w:t>pm2 save</w:t>
-      </w:r>
-    </w:p>
-    <w:p>
-      <w:r>
-        <w:t>Make pm2 start on reboot:</w:t>
-      </w:r>
-    </w:p>
-    <w:p>
-      <w:pPr>
-        <w:spacing w:after="120"/>
-        <w:ind w:left="240"/>
-      </w:pPr>
-      <w:r>
-        <w:rPr>
-          <w:rFonts w:ascii="Consolas" w:hAnsi="Consolas"/>
-          <w:sz w:val="18"/>
-        </w:rPr>
-        <w:t>pm2 startup systemd   # run the sudo ... line it prints, then:</w:t>
         <w:br/>
-        <w:t>pm2 save</w:t>
-      </w:r>
-    </w:p>
-    <w:p>
-      <w:r>
-        <w:t>Check both are up:</w:t>
-      </w:r>
-    </w:p>
-    <w:p>
-      <w:pPr>
-        <w:spacing w:after="120"/>
-        <w:ind w:left="240"/>
-      </w:pPr>
-      <w:r>
-        <w:rPr>
-          <w:rFonts w:ascii="Consolas" w:hAnsi="Consolas"/>
-          <w:sz w:val="18"/>
-        </w:rPr>
-        <w:t>pm2 status   # expect: backend (online) and Frontend (online)</w:t>
+        <w:t>pm2 startup systemd   # run the sudo ... line it prints, then: pm2 save</w:t>
+        <w:br/>
+        <w:t>pm2 status            # expect backend + Frontend online</w:t>
       </w:r>
     </w:p>
     <w:p>
@@ -550,7 +554,7 @@
         </w:rPr>
         <w:t>// baseURL: 'http://localhost:5001', // local development</w:t>
         <w:br/>
-        <w:t>baseURL: 'http://3.106.x.x:5001', // live (EC2)</w:t>
+        <w:t>baseURL: 'http://&lt;PUBLIC_IP&gt;:5001', // live (EC2)</w:t>
       </w:r>
     </w:p>
     <w:p>
@@ -572,7 +576,7 @@
     </w:p>
     <w:p>
       <w:r>
-        <w:t>The runner rebuilds the frontend (now baked with your IP) and pm2 restart all serves it. Refresh http://&lt;public-ip&gt;/ - the app should talk to the backend.</w:t>
+        <w:t>The runner rebuilds the frontend with your IP and pm2 restart serves it. Refresh http://&lt;public-ip&gt;/ - the app should now talk to the backend.</w:t>
       </w:r>
     </w:p>
     <w:p>
@@ -625,7 +629,7 @@
     </w:p>
     <w:p>
       <w:r>
-        <w:t>Send me the public IP and I will update the report cover, 7, and Part C, and reframe 7 from constraint to a working self-hosted-runner deployment.</w:t>
+        <w:t>Send me the public IP and I will update the report cover, section 7, and Part C, and reframe section 7 from constraint to a working self-hosted-runner deployment.</w:t>
       </w:r>
     </w:p>
     <w:p>
@@ -641,6 +645,22 @@
         <w:pStyle w:val="ListBullet"/>
       </w:pPr>
       <w:r>
+        <w:t>Launch fails -&gt; instance type too big for the student account; use t3.medium (or t2.micro + swap, but t2.micro often OOMs on the React build).</w:t>
+      </w:r>
+    </w:p>
+    <w:p>
+      <w:pPr>
+        <w:pStyle w:val="ListBullet"/>
+      </w:pPr>
+      <w:r>
+        <w:t>Cannot SSH -&gt; add your computer IP (My IP) to the SSH rule; confirm you used user ubuntu.</w:t>
+      </w:r>
+    </w:p>
+    <w:p>
+      <w:pPr>
+        <w:pStyle w:val="ListBullet"/>
+      </w:pPr>
+      <w:r>
         <w:t>Workflow Queued forever -&gt; runner not Idle: sudo ./svc.sh status; sudo ./svc.sh start.</w:t>
       </w:r>
     </w:p>
@@ -649,7 +669,7 @@
         <w:pStyle w:val="ListBullet"/>
       </w:pPr>
       <w:r>
-        <w:t>pm2: command not found in the job -&gt; re-run the symlink loop in Step 3 (for t in node npm npx pm2 yarn ...).</w:t>
+        <w:t>pm2: command not found in the job -&gt; re-run the symlink loop in Step 4.</w:t>
       </w:r>
     </w:p>
     <w:p>
@@ -657,7 +677,7 @@
         <w:pStyle w:val="ListBullet"/>
       </w:pPr>
       <w:r>
-        <w:t>npm ci step fails -&gt; run it once on the box in the workspace root to sync, or tell me and I will relax it.</w:t>
+        <w:t>App loads but API fails -&gt; wrong live IP in axiosConfig.js or port 5001 not open. Test http://&lt;public-ip&gt;:5001/api/health -&gt; {"status":"OK"}.</w:t>
       </w:r>
     </w:p>
     <w:p>
@@ -665,7 +685,7 @@
         <w:pStyle w:val="ListBullet"/>
       </w:pPr>
       <w:r>
-        <w:t>App loads but API fails -&gt; wrong live IP in axiosConfig.js, or port 5001 not open. Test http://&lt;public-ip&gt;:5001/api/health -&gt; {"status":"OK"}.</w:t>
+        <w:t>yarn build out of memory -&gt; use t3.medium or larger.</w:t>
       </w:r>
     </w:p>
     <w:p>
@@ -673,23 +693,7 @@
         <w:pStyle w:val="ListBullet"/>
       </w:pPr>
       <w:r>
-        <w:t>yarn build out of memory -&gt; instance smaller than t3.large; resize it.</w:t>
-      </w:r>
-    </w:p>
-    <w:p>
-      <w:pPr>
-        <w:pStyle w:val="ListBullet"/>
-      </w:pPr>
-      <w:r>
-        <w:t>nginx 502 -&gt; Frontend pm2 process not up; redo Step 7 or pm2 restart Frontend.</w:t>
-      </w:r>
-    </w:p>
-    <w:p>
-      <w:pPr>
-        <w:pStyle w:val="ListBullet"/>
-      </w:pPr>
-      <w:r>
-        <w:t>Cost -&gt; STOP/TERMINATE the t3.large when done. Public IP changes on stop/start unless you attach an Elastic IP.</w:t>
+        <w:t>IP changed -&gt; you stopped/started the instance; update axiosConfig.js with the new IP and push again.</w:t>
       </w:r>
     </w:p>
     <w:sectPr>

</xml_diff>